<commit_message>
DMWorks: 쟁점표에서 DM-Monitoring vs OCS 관제·USD 기구 정의 삭제
Co-Authored-By: Claude Opus 5.5 <noreply@anthropic.com>
</commit_message>
<xml_diff>
--- a/docs/dmworks_zones.docx
+++ b/docs/dmworks_zones.docx
@@ -20929,10 +20929,10 @@
       </w:tblPr>
       <w:tblGrid>
         <w:gridCol w:w="849"/>
-        <w:gridCol w:w="3208"/>
-        <w:gridCol w:w="9213"/>
-        <w:gridCol w:w="4692"/>
-        <w:gridCol w:w="4488"/>
+        <w:gridCol w:w="1380"/>
+        <w:gridCol w:w="10734"/>
+        <w:gridCol w:w="4499"/>
+        <w:gridCol w:w="4989"/>
       </w:tblGrid>
       <w:tr>
         <w:trPr>
@@ -20961,7 +20961,7 @@
         </w:tc>
         <w:tc>
           <w:tcPr>
-            <w:tcW w:type="dxa" w:w="3208"/>
+            <w:tcW w:type="dxa" w:w="1380"/>
             <w:shd w:val="clear" w:color="auto" w:fill="10214B"/>
           </w:tcPr>
           <w:p>
@@ -20981,7 +20981,7 @@
         </w:tc>
         <w:tc>
           <w:tcPr>
-            <w:tcW w:type="dxa" w:w="9213"/>
+            <w:tcW w:type="dxa" w:w="10734"/>
             <w:shd w:val="clear" w:color="auto" w:fill="10214B"/>
           </w:tcPr>
           <w:p>
@@ -21001,7 +21001,7 @@
         </w:tc>
         <w:tc>
           <w:tcPr>
-            <w:tcW w:type="dxa" w:w="4692"/>
+            <w:tcW w:type="dxa" w:w="4499"/>
             <w:shd w:val="clear" w:color="auto" w:fill="10214B"/>
           </w:tcPr>
           <w:p>
@@ -21021,7 +21021,7 @@
         </w:tc>
         <w:tc>
           <w:tcPr>
-            <w:tcW w:type="dxa" w:w="4488"/>
+            <w:tcW w:type="dxa" w:w="4989"/>
             <w:shd w:val="clear" w:color="auto" w:fill="10214B"/>
           </w:tcPr>
           <w:p>
@@ -21050,6 +21050,7 @@
           </w:tcPr>
           <w:p>
             <w:pPr>
+              <w:keepNext/>
               <w:spacing w:before="0" w:after="0" w:line="252" w:lineRule="auto"/>
             </w:pPr>
             <w:r>
@@ -21065,11 +21066,12 @@
         </w:tc>
         <w:tc>
           <w:tcPr>
-            <w:tcW w:type="dxa" w:w="3208"/>
+            <w:tcW w:type="dxa" w:w="1380"/>
             <w:shd w:val="clear" w:color="auto" w:fill="EEF2F9"/>
           </w:tcPr>
           <w:p>
             <w:pPr>
+              <w:keepNext/>
               <w:spacing w:before="0" w:after="0" w:line="252" w:lineRule="auto"/>
             </w:pPr>
             <w:r>
@@ -21085,10 +21087,11 @@
         </w:tc>
         <w:tc>
           <w:tcPr>
-            <w:tcW w:type="dxa" w:w="9213"/>
-          </w:tcPr>
-          <w:p>
-            <w:pPr>
+            <w:tcW w:type="dxa" w:w="10734"/>
+          </w:tcPr>
+          <w:p>
+            <w:pPr>
+              <w:keepNext/>
               <w:spacing w:before="0" w:after="0" w:line="252" w:lineRule="auto"/>
             </w:pPr>
             <w:r>
@@ -21104,10 +21107,11 @@
         </w:tc>
         <w:tc>
           <w:tcPr>
-            <w:tcW w:type="dxa" w:w="4692"/>
-          </w:tcPr>
-          <w:p>
-            <w:pPr>
+            <w:tcW w:type="dxa" w:w="4499"/>
+          </w:tcPr>
+          <w:p>
+            <w:pPr>
+              <w:keepNext/>
               <w:spacing w:before="0" w:after="0" w:line="252" w:lineRule="auto"/>
             </w:pPr>
             <w:r>
@@ -21123,10 +21127,11 @@
         </w:tc>
         <w:tc>
           <w:tcPr>
-            <w:tcW w:type="dxa" w:w="4488"/>
-          </w:tcPr>
-          <w:p>
-            <w:pPr>
+            <w:tcW w:type="dxa" w:w="4989"/>
+          </w:tcPr>
+          <w:p>
+            <w:pPr>
+              <w:keepNext/>
               <w:spacing w:before="0" w:after="0" w:line="252" w:lineRule="auto"/>
             </w:pPr>
             <w:r>
@@ -21151,6 +21156,7 @@
           </w:tcPr>
           <w:p>
             <w:pPr>
+              <w:keepNext/>
               <w:spacing w:before="0" w:after="0" w:line="252" w:lineRule="auto"/>
             </w:pPr>
             <w:r>
@@ -21166,11 +21172,12 @@
         </w:tc>
         <w:tc>
           <w:tcPr>
-            <w:tcW w:type="dxa" w:w="3208"/>
+            <w:tcW w:type="dxa" w:w="1380"/>
             <w:shd w:val="clear" w:color="auto" w:fill="EEF2F9"/>
           </w:tcPr>
           <w:p>
             <w:pPr>
+              <w:keepNext/>
               <w:spacing w:before="0" w:after="0" w:line="252" w:lineRule="auto"/>
             </w:pPr>
             <w:r>
@@ -21186,10 +21193,11 @@
         </w:tc>
         <w:tc>
           <w:tcPr>
-            <w:tcW w:type="dxa" w:w="9213"/>
-          </w:tcPr>
-          <w:p>
-            <w:pPr>
+            <w:tcW w:type="dxa" w:w="10734"/>
+          </w:tcPr>
+          <w:p>
+            <w:pPr>
+              <w:keepNext/>
               <w:spacing w:before="0" w:after="0" w:line="252" w:lineRule="auto"/>
             </w:pPr>
             <w:r>
@@ -21205,10 +21213,11 @@
         </w:tc>
         <w:tc>
           <w:tcPr>
-            <w:tcW w:type="dxa" w:w="4692"/>
-          </w:tcPr>
-          <w:p>
-            <w:pPr>
+            <w:tcW w:type="dxa" w:w="4499"/>
+          </w:tcPr>
+          <w:p>
+            <w:pPr>
+              <w:keepNext/>
               <w:spacing w:before="0" w:after="0" w:line="252" w:lineRule="auto"/>
             </w:pPr>
             <w:r>
@@ -21224,10 +21233,11 @@
         </w:tc>
         <w:tc>
           <w:tcPr>
-            <w:tcW w:type="dxa" w:w="4488"/>
-          </w:tcPr>
-          <w:p>
-            <w:pPr>
+            <w:tcW w:type="dxa" w:w="4989"/>
+          </w:tcPr>
+          <w:p>
+            <w:pPr>
+              <w:keepNext/>
               <w:spacing w:before="0" w:after="0" w:line="252" w:lineRule="auto"/>
             </w:pPr>
             <w:r>
@@ -21262,13 +21272,13 @@
                 <w:color w:val="13203F"/>
                 <w:sz w:val="16"/>
               </w:rPr>
-              <w:t>SW</w:t>
-            </w:r>
-          </w:p>
-        </w:tc>
-        <w:tc>
-          <w:tcPr>
-            <w:tcW w:type="dxa" w:w="3208"/>
+              <w:t>로봇·PLC</w:t>
+            </w:r>
+          </w:p>
+        </w:tc>
+        <w:tc>
+          <w:tcPr>
+            <w:tcW w:type="dxa" w:w="1380"/>
             <w:shd w:val="clear" w:color="auto" w:fill="EEF2F9"/>
           </w:tcPr>
           <w:p>
@@ -21283,13 +21293,13 @@
                 <w:color w:val="1B3A73"/>
                 <w:sz w:val="16"/>
               </w:rPr>
-              <w:t>DM-Monitoring vs OCS 관제</w:t>
-            </w:r>
-          </w:p>
-        </w:tc>
-        <w:tc>
-          <w:tcPr>
-            <w:tcW w:type="dxa" w:w="9213"/>
+              <w:t>메이커 가정</w:t>
+            </w:r>
+          </w:p>
+        </w:tc>
+        <w:tc>
+          <w:tcPr>
+            <w:tcW w:type="dxa" w:w="10734"/>
           </w:tcPr>
           <w:p>
             <w:pPr>
@@ -21303,13 +21313,13 @@
                 <w:color w:val="13203F"/>
                 <w:sz w:val="16"/>
               </w:rPr>
-              <w:t>DM-Monitoring·DB 연동 시각화 UI는 DT 화면, OCS Cell은 운영 관제를 맡음</w:t>
-            </w:r>
-          </w:p>
-        </w:tc>
-        <w:tc>
-          <w:tcPr>
-            <w:tcW w:type="dxa" w:w="4692"/>
+              <w:t>OLP·ACS·AIMS 컨트롤러(현대·가와사키 / 야스카와·쿠카 / 화낙·ABB)와 PLC(LS·미쓰비시 / 지멘스 / 로크웰)가 존마다 다르게 임의 배정</w:t>
+            </w:r>
+          </w:p>
+        </w:tc>
+        <w:tc>
+          <w:tcPr>
+            <w:tcW w:type="dxa" w:w="4499"/>
           </w:tcPr>
           <w:p>
             <w:pPr>
@@ -21323,13 +21333,13 @@
                 <w:color w:val="13203F"/>
                 <w:sz w:val="16"/>
               </w:rPr>
-              <w:t>화면·데이터 경계가 흐리면 운영 혼선</w:t>
-            </w:r>
-          </w:p>
-        </w:tc>
-        <w:tc>
-          <w:tcPr>
-            <w:tcW w:type="dxa" w:w="4488"/>
+              <w:t>실제 발주 기종과 다르면 옵션 교체 필요</w:t>
+            </w:r>
+          </w:p>
+        </w:tc>
+        <w:tc>
+          <w:tcPr>
+            <w:tcW w:type="dxa" w:w="4989"/>
           </w:tcPr>
           <w:p>
             <w:pPr>
@@ -21343,7 +21353,7 @@
                 <w:color w:val="13203F"/>
                 <w:sz w:val="16"/>
               </w:rPr>
-              <w:t>DT 모니터링은 DMWorks, 운영 관제는 OCS로 경계 정의</w:t>
+              <w:t>존별 로봇·PLC 메이커 확정 후 옵션 재산정</w:t>
             </w:r>
           </w:p>
         </w:tc>
@@ -21358,28 +21368,26 @@
           </w:tcPr>
           <w:p>
             <w:pPr>
-              <w:keepNext/>
-              <w:spacing w:before="0" w:after="0" w:line="252" w:lineRule="auto"/>
-            </w:pPr>
-            <w:r>
-              <w:rPr>
-                <w:rFonts w:ascii="맑은 고딕" w:hAnsi="맑은 고딕" w:eastAsia="맑은 고딕"/>
-                <w:b w:val="0"/>
-                <w:color w:val="13203F"/>
-                <w:sz w:val="16"/>
-              </w:rPr>
-              <w:t>SW</w:t>
-            </w:r>
-          </w:p>
-        </w:tc>
-        <w:tc>
-          <w:tcPr>
-            <w:tcW w:type="dxa" w:w="3208"/>
+              <w:spacing w:before="0" w:after="0" w:line="252" w:lineRule="auto"/>
+            </w:pPr>
+            <w:r>
+              <w:rPr>
+                <w:rFonts w:ascii="맑은 고딕" w:hAnsi="맑은 고딕" w:eastAsia="맑은 고딕"/>
+                <w:b w:val="0"/>
+                <w:color w:val="13203F"/>
+                <w:sz w:val="16"/>
+              </w:rPr>
+              <w:t>범위</w:t>
+            </w:r>
+          </w:p>
+        </w:tc>
+        <w:tc>
+          <w:tcPr>
+            <w:tcW w:type="dxa" w:w="1380"/>
             <w:shd w:val="clear" w:color="auto" w:fill="EEF2F9"/>
           </w:tcPr>
           <w:p>
             <w:pPr>
-              <w:keepNext/>
               <w:spacing w:before="0" w:after="0" w:line="252" w:lineRule="auto"/>
             </w:pPr>
             <w:r>
@@ -21389,223 +21397,13 @@
                 <w:color w:val="1B3A73"/>
                 <w:sz w:val="16"/>
               </w:rPr>
-              <w:t>USD 기구 정의</w:t>
-            </w:r>
-          </w:p>
-        </w:tc>
-        <w:tc>
-          <w:tcPr>
-            <w:tcW w:type="dxa" w:w="9213"/>
-          </w:tcPr>
-          <w:p>
-            <w:pPr>
-              <w:keepNext/>
-              <w:spacing w:before="0" w:after="0" w:line="252" w:lineRule="auto"/>
-            </w:pPr>
-            <w:r>
-              <w:rPr>
-                <w:rFonts w:ascii="맑은 고딕" w:hAnsi="맑은 고딕" w:eastAsia="맑은 고딕"/>
-                <w:b w:val="0"/>
-                <w:color w:val="13203F"/>
-                <w:sz w:val="16"/>
-              </w:rPr>
-              <w:t>USD Converter의 기구(Kinematic) 변환은 '요청 사항 협의 후 개발 예정'</w:t>
-            </w:r>
-          </w:p>
-        </w:tc>
-        <w:tc>
-          <w:tcPr>
-            <w:tcW w:type="dxa" w:w="4692"/>
-          </w:tcPr>
-          <w:p>
-            <w:pPr>
-              <w:keepNext/>
-              <w:spacing w:before="0" w:after="0" w:line="252" w:lineRule="auto"/>
-            </w:pPr>
-            <w:r>
-              <w:rPr>
-                <w:rFonts w:ascii="맑은 고딕" w:hAnsi="맑은 고딕" w:eastAsia="맑은 고딕"/>
-                <w:b w:val="0"/>
-                <w:color w:val="13203F"/>
-                <w:sz w:val="16"/>
-              </w:rPr>
-              <w:t>Isaac Sim 학습 DT 이관 시 여전히 재구축 필요할 수 있음</w:t>
-            </w:r>
-          </w:p>
-        </w:tc>
-        <w:tc>
-          <w:tcPr>
-            <w:tcW w:type="dxa" w:w="4488"/>
-          </w:tcPr>
-          <w:p>
-            <w:pPr>
-              <w:keepNext/>
-              <w:spacing w:before="0" w:after="0" w:line="252" w:lineRule="auto"/>
-            </w:pPr>
-            <w:r>
-              <w:rPr>
-                <w:rFonts w:ascii="맑은 고딕" w:hAnsi="맑은 고딕" w:eastAsia="맑은 고딕"/>
-                <w:b w:val="0"/>
-                <w:color w:val="13203F"/>
-                <w:sz w:val="16"/>
-              </w:rPr>
-              <w:t>개발 범위·일정을 견적에 명시 요청</w:t>
-            </w:r>
-          </w:p>
-        </w:tc>
-      </w:tr>
-      <w:tr>
-        <w:trPr>
-          <w:cantSplit/>
-        </w:trPr>
-        <w:tc>
-          <w:tcPr>
-            <w:tcW w:type="dxa" w:w="849"/>
-          </w:tcPr>
-          <w:p>
-            <w:pPr>
-              <w:keepNext/>
-              <w:spacing w:before="0" w:after="0" w:line="252" w:lineRule="auto"/>
-            </w:pPr>
-            <w:r>
-              <w:rPr>
-                <w:rFonts w:ascii="맑은 고딕" w:hAnsi="맑은 고딕" w:eastAsia="맑은 고딕"/>
-                <w:b w:val="0"/>
-                <w:color w:val="13203F"/>
-                <w:sz w:val="16"/>
-              </w:rPr>
-              <w:t>로봇·PLC</w:t>
-            </w:r>
-          </w:p>
-        </w:tc>
-        <w:tc>
-          <w:tcPr>
-            <w:tcW w:type="dxa" w:w="3208"/>
-            <w:shd w:val="clear" w:color="auto" w:fill="EEF2F9"/>
-          </w:tcPr>
-          <w:p>
-            <w:pPr>
-              <w:keepNext/>
-              <w:spacing w:before="0" w:after="0" w:line="252" w:lineRule="auto"/>
-            </w:pPr>
-            <w:r>
-              <w:rPr>
-                <w:rFonts w:ascii="맑은 고딕" w:hAnsi="맑은 고딕" w:eastAsia="맑은 고딕"/>
-                <w:b/>
-                <w:color w:val="1B3A73"/>
-                <w:sz w:val="16"/>
-              </w:rPr>
-              <w:t>메이커 가정</w:t>
-            </w:r>
-          </w:p>
-        </w:tc>
-        <w:tc>
-          <w:tcPr>
-            <w:tcW w:type="dxa" w:w="9213"/>
-          </w:tcPr>
-          <w:p>
-            <w:pPr>
-              <w:keepNext/>
-              <w:spacing w:before="0" w:after="0" w:line="252" w:lineRule="auto"/>
-            </w:pPr>
-            <w:r>
-              <w:rPr>
-                <w:rFonts w:ascii="맑은 고딕" w:hAnsi="맑은 고딕" w:eastAsia="맑은 고딕"/>
-                <w:b w:val="0"/>
-                <w:color w:val="13203F"/>
-                <w:sz w:val="16"/>
-              </w:rPr>
-              <w:t>OLP·ACS·AIMS 컨트롤러(현대·가와사키 / 야스카와·쿠카 / 화낙·ABB)와 PLC(LS·미쓰비시 / 지멘스 / 로크웰)가 존마다 다르게 임의 배정</w:t>
-            </w:r>
-          </w:p>
-        </w:tc>
-        <w:tc>
-          <w:tcPr>
-            <w:tcW w:type="dxa" w:w="4692"/>
-          </w:tcPr>
-          <w:p>
-            <w:pPr>
-              <w:keepNext/>
-              <w:spacing w:before="0" w:after="0" w:line="252" w:lineRule="auto"/>
-            </w:pPr>
-            <w:r>
-              <w:rPr>
-                <w:rFonts w:ascii="맑은 고딕" w:hAnsi="맑은 고딕" w:eastAsia="맑은 고딕"/>
-                <w:b w:val="0"/>
-                <w:color w:val="13203F"/>
-                <w:sz w:val="16"/>
-              </w:rPr>
-              <w:t>실제 발주 기종과 다르면 옵션 교체 필요</w:t>
-            </w:r>
-          </w:p>
-        </w:tc>
-        <w:tc>
-          <w:tcPr>
-            <w:tcW w:type="dxa" w:w="4488"/>
-          </w:tcPr>
-          <w:p>
-            <w:pPr>
-              <w:keepNext/>
-              <w:spacing w:before="0" w:after="0" w:line="252" w:lineRule="auto"/>
-            </w:pPr>
-            <w:r>
-              <w:rPr>
-                <w:rFonts w:ascii="맑은 고딕" w:hAnsi="맑은 고딕" w:eastAsia="맑은 고딕"/>
-                <w:b w:val="0"/>
-                <w:color w:val="13203F"/>
-                <w:sz w:val="16"/>
-              </w:rPr>
-              <w:t>존별 로봇·PLC 메이커 확정 후 옵션 재산정</w:t>
-            </w:r>
-          </w:p>
-        </w:tc>
-      </w:tr>
-      <w:tr>
-        <w:trPr>
-          <w:cantSplit/>
-        </w:trPr>
-        <w:tc>
-          <w:tcPr>
-            <w:tcW w:type="dxa" w:w="849"/>
-          </w:tcPr>
-          <w:p>
-            <w:pPr>
-              <w:spacing w:before="0" w:after="0" w:line="252" w:lineRule="auto"/>
-            </w:pPr>
-            <w:r>
-              <w:rPr>
-                <w:rFonts w:ascii="맑은 고딕" w:hAnsi="맑은 고딕" w:eastAsia="맑은 고딕"/>
-                <w:b w:val="0"/>
-                <w:color w:val="13203F"/>
-                <w:sz w:val="16"/>
-              </w:rPr>
-              <w:t>범위</w:t>
-            </w:r>
-          </w:p>
-        </w:tc>
-        <w:tc>
-          <w:tcPr>
-            <w:tcW w:type="dxa" w:w="3208"/>
-            <w:shd w:val="clear" w:color="auto" w:fill="EEF2F9"/>
-          </w:tcPr>
-          <w:p>
-            <w:pPr>
-              <w:spacing w:before="0" w:after="0" w:line="252" w:lineRule="auto"/>
-            </w:pPr>
-            <w:r>
-              <w:rPr>
-                <w:rFonts w:ascii="맑은 고딕" w:hAnsi="맑은 고딕" w:eastAsia="맑은 고딕"/>
-                <w:b/>
-                <w:color w:val="1B3A73"/>
-                <w:sz w:val="16"/>
-              </w:rPr>
               <w:t>정밀조립 미포함</w:t>
             </w:r>
           </w:p>
         </w:tc>
         <w:tc>
           <w:tcPr>
-            <w:tcW w:type="dxa" w:w="9213"/>
+            <w:tcW w:type="dxa" w:w="10734"/>
           </w:tcPr>
           <w:p>
             <w:pPr>
@@ -21624,7 +21422,7 @@
         </w:tc>
         <w:tc>
           <w:tcPr>
-            <w:tcW w:type="dxa" w:w="4692"/>
+            <w:tcW w:type="dxa" w:w="4499"/>
           </w:tcPr>
           <w:p>
             <w:pPr>
@@ -21643,7 +21441,7 @@
         </w:tc>
         <w:tc>
           <w:tcPr>
-            <w:tcW w:type="dxa" w:w="4488"/>
+            <w:tcW w:type="dxa" w:w="4989"/>
           </w:tcPr>
           <w:p>
             <w:pPr>

</xml_diff>

<commit_message>
DMWorks: 검토 범례에서 조정 설명 삭제, A-1-4 Plug-in Developer 의견 정리
Co-Authored-By: Claude Opus 5.5 <noreply@anthropic.com>
</commit_message>
<xml_diff>
--- a/docs/dmworks_zones.docx
+++ b/docs/dmworks_zones.docx
@@ -2730,25 +2730,7 @@
           <w:color w:val="13203F"/>
           <w:sz w:val="17"/>
         </w:rPr>
-        <w:t xml:space="preserve"> 기종·포맷·역할 확정 후 결정 · </w:t>
-      </w:r>
-      <w:r>
-        <w:rPr>
-          <w:rFonts w:ascii="맑은 고딕" w:hAnsi="맑은 고딕" w:eastAsia="맑은 고딕"/>
-          <w:b/>
-          <w:color w:val="13203F"/>
-          <w:sz w:val="17"/>
-        </w:rPr>
-        <w:t>조정</w:t>
-      </w:r>
-      <w:r>
-        <w:rPr>
-          <w:rFonts w:ascii="맑은 고딕" w:hAnsi="맑은 고딕" w:eastAsia="맑은 고딕"/>
-          <w:b w:val="0"/>
-          <w:color w:val="13203F"/>
-          <w:sz w:val="17"/>
-        </w:rPr>
-        <w:t xml:space="preserve"> 줄이거나 빼기를 제안.</w:t>
+        <w:t xml:space="preserve"> 계상 조건 확인 후 결정.</w:t>
       </w:r>
     </w:p>
     <w:tbl>
@@ -8695,7 +8677,7 @@
                 <w:color w:val="13203F"/>
                 <w:sz w:val="16"/>
               </w:rPr>
-              <w:t>3존 공통 개발 거점으로 유지</w:t>
+              <w:t>존 전용 Plug-in 개발</w:t>
             </w:r>
           </w:p>
         </w:tc>

</xml_diff>